<commit_message>
added game controls to acm format
</commit_message>
<xml_diff>
--- a/docs/paper/ACM-fireflies.docx
+++ b/docs/paper/ACM-fireflies.docx
@@ -2741,21 +2741,7 @@
           <w:rFonts w:ascii="Times New Roman" w:hAnsi="Times New Roman" w:cs="Times New Roman"/>
           <w:szCs w:val="24"/>
         </w:rPr>
-        <w:t>During the player's turn, she can choose to attack instead of moving to another tile. This will cause the player to enter the attack phase, where a marker will appear one (1) tile from her position and she may choose to attack one tile north, east, south, or west, this is shown in Figure 4. The player may also cancel the attack and return to her normal state, doing this will not cost the player a turn and she may either choose to move or attack</w:t>
-      </w:r>
-      <w:r>
-        <w:rPr>
-          <w:rFonts w:ascii="Times New Roman" w:hAnsi="Times New Roman" w:cs="Times New Roman"/>
-          <w:szCs w:val="24"/>
-        </w:rPr>
-        <w:t xml:space="preserve"> </w:t>
-      </w:r>
-      <w:r>
-        <w:rPr>
-          <w:rFonts w:ascii="Times New Roman" w:hAnsi="Times New Roman" w:cs="Times New Roman"/>
-          <w:szCs w:val="24"/>
-        </w:rPr>
-        <w:t xml:space="preserve">again. </w:t>
+        <w:t xml:space="preserve">During the player's turn, she can choose to attack instead of moving to another tile. This will cause the player to enter the attack phase, where a marker will appear one (1) tile from her position and she may choose to attack one tile north, east, south, or west, this is shown in Figure 4. The player may also cancel the attack and return to her normal state, doing this will not cost the player a turn and she may either choose to move or attack again. </w:t>
       </w:r>
     </w:p>
     <w:p>
@@ -3163,7 +3149,69 @@
       <w:pPr>
         <w:pStyle w:val="ListParagraph"/>
         <w:spacing w:after="120" w:line="240" w:lineRule="auto"/>
+        <w:ind w:left="0" w:firstLine="720"/>
+        <w:jc w:val="both"/>
+        <w:rPr>
+          <w:rFonts w:ascii="Times New Roman" w:hAnsi="Times New Roman" w:cs="Times New Roman"/>
+          <w:szCs w:val="24"/>
+        </w:rPr>
+      </w:pPr>
+      <w:r>
+        <w:rPr>
+          <w:rFonts w:ascii="Times New Roman" w:hAnsi="Times New Roman" w:cs="Times New Roman"/>
+          <w:szCs w:val="24"/>
+        </w:rPr>
+        <w:t xml:space="preserve">The game Fireflies can be played using keyboard controls. Using the arrow keys will allow the player to move around and explore the map while the space bar will show an indicator and allow the player to attack once an enemy is encountered. </w:t>
+      </w:r>
+    </w:p>
+    <w:p>
+      <w:pPr>
+        <w:pStyle w:val="ListParagraph"/>
+        <w:spacing w:after="120" w:line="240" w:lineRule="auto"/>
         <w:ind w:left="0"/>
+        <w:jc w:val="both"/>
+        <w:rPr>
+          <w:rFonts w:ascii="Times New Roman" w:hAnsi="Times New Roman" w:cs="Times New Roman"/>
+          <w:szCs w:val="24"/>
+        </w:rPr>
+      </w:pPr>
+    </w:p>
+    <w:p>
+      <w:pPr>
+        <w:pStyle w:val="ListParagraph"/>
+        <w:spacing w:after="120" w:line="240" w:lineRule="auto"/>
+        <w:ind w:left="0" w:firstLine="720"/>
+        <w:jc w:val="both"/>
+        <w:rPr>
+          <w:rFonts w:ascii="Times New Roman" w:hAnsi="Times New Roman" w:cs="Times New Roman"/>
+          <w:szCs w:val="24"/>
+        </w:rPr>
+      </w:pPr>
+      <w:r>
+        <w:rPr>
+          <w:rFonts w:ascii="Times New Roman" w:hAnsi="Times New Roman" w:cs="Times New Roman"/>
+          <w:szCs w:val="24"/>
+        </w:rPr>
+        <w:t xml:space="preserve">Once the indicator is shown, the player can choose whether which direction she will attack using the arrow keys. When the player determines which direction she will attack, the player can choose which skill she will use in order to defeat an enemy using the Q, W and E keys. </w:t>
+      </w:r>
+    </w:p>
+    <w:p>
+      <w:pPr>
+        <w:pStyle w:val="ListParagraph"/>
+        <w:spacing w:after="120" w:line="240" w:lineRule="auto"/>
+        <w:ind w:left="0"/>
+        <w:jc w:val="both"/>
+        <w:rPr>
+          <w:rFonts w:ascii="Times New Roman" w:hAnsi="Times New Roman" w:cs="Times New Roman"/>
+          <w:szCs w:val="24"/>
+        </w:rPr>
+      </w:pPr>
+    </w:p>
+    <w:p>
+      <w:pPr>
+        <w:pStyle w:val="ListParagraph"/>
+        <w:spacing w:after="120" w:line="240" w:lineRule="auto"/>
+        <w:ind w:left="0" w:firstLine="360"/>
         <w:jc w:val="both"/>
         <w:rPr>
           <w:rFonts w:ascii="Times New Roman" w:hAnsi="Times New Roman" w:cs="Times New Roman"/>
@@ -3172,6 +3220,13 @@
       </w:pPr>
       <w:bookmarkStart w:id="0" w:name="_GoBack"/>
       <w:bookmarkEnd w:id="0"/>
+      <w:r>
+        <w:rPr>
+          <w:rFonts w:ascii="Times New Roman" w:hAnsi="Times New Roman" w:cs="Times New Roman"/>
+          <w:szCs w:val="24"/>
+        </w:rPr>
+        <w:t>The Q key will stand for the “cut” skill which will output a “bleed” effect, the W key being the “stable” which will have a “disarm” effect and the E key will be the “brute” skill which will have a “stun” effect.</w:t>
+      </w:r>
     </w:p>
     <w:p>
       <w:pPr>
@@ -3505,14 +3560,7 @@
           <w:rFonts w:ascii="Times New Roman" w:hAnsi="Times New Roman" w:cs="Times New Roman"/>
           <w:szCs w:val="24"/>
         </w:rPr>
-        <w:t xml:space="preserve">, Kenneth O. Stanley, and Cameron Browne. Search-Based Procedural Content </w:t>
-      </w:r>
-      <w:r>
-        <w:rPr>
-          <w:rFonts w:ascii="Times New Roman" w:hAnsi="Times New Roman" w:cs="Times New Roman"/>
-          <w:szCs w:val="24"/>
-        </w:rPr>
-        <w:t xml:space="preserve">Generation: A Taxonomy and Survey. </w:t>
+        <w:t xml:space="preserve">, Kenneth O. Stanley, and Cameron Browne. Search-Based Procedural Content Generation: A Taxonomy and Survey. </w:t>
       </w:r>
       <w:r>
         <w:rPr>
@@ -3951,7 +3999,16 @@
           <w:i/>
           <w:szCs w:val="24"/>
         </w:rPr>
-        <w:t>Proceedings of the 2nd international workshop on procedural content generation in games. ACM, 2011</w:t>
+        <w:t xml:space="preserve">Proceedings of the 2nd international </w:t>
+      </w:r>
+      <w:r>
+        <w:rPr>
+          <w:rFonts w:ascii="Times New Roman" w:hAnsi="Times New Roman" w:cs="Times New Roman"/>
+          <w:i/>
+          <w:szCs w:val="24"/>
+        </w:rPr>
+        <w:lastRenderedPageBreak/>
+        <w:t>workshop on procedural content generation in games. ACM, 2011</w:t>
       </w:r>
       <w:r>
         <w:rPr>
@@ -4737,6 +4794,7 @@
     <w:lsdException w:name="HTML Sample" w:semiHidden="1" w:unhideWhenUsed="1"/>
     <w:lsdException w:name="HTML Typewriter" w:semiHidden="1" w:unhideWhenUsed="1"/>
     <w:lsdException w:name="HTML Variable" w:semiHidden="1" w:unhideWhenUsed="1"/>
+    <w:lsdException w:name="Normal Table" w:semiHidden="1" w:unhideWhenUsed="1"/>
     <w:lsdException w:name="annotation subject" w:semiHidden="1" w:unhideWhenUsed="1"/>
     <w:lsdException w:name="No List" w:semiHidden="1" w:unhideWhenUsed="1"/>
     <w:lsdException w:name="Outline List 1" w:semiHidden="1" w:unhideWhenUsed="1"/>
@@ -4783,8 +4841,10 @@
     <w:lsdException w:name="Table Subtle 2" w:semiHidden="1" w:unhideWhenUsed="1"/>
     <w:lsdException w:name="Table Web 1" w:semiHidden="1" w:unhideWhenUsed="1"/>
     <w:lsdException w:name="Table Web 2" w:semiHidden="1" w:unhideWhenUsed="1"/>
+    <w:lsdException w:name="Table Web 3" w:semiHidden="1" w:unhideWhenUsed="1"/>
     <w:lsdException w:name="Balloon Text" w:semiHidden="1" w:unhideWhenUsed="1"/>
     <w:lsdException w:name="Table Grid" w:uiPriority="39"/>
+    <w:lsdException w:name="Table Theme" w:semiHidden="1" w:unhideWhenUsed="1"/>
     <w:lsdException w:name="Placeholder Text" w:semiHidden="1"/>
     <w:lsdException w:name="No Spacing" w:uiPriority="1" w:qFormat="1"/>
     <w:lsdException w:name="Light Shading" w:uiPriority="60"/>

</xml_diff>